<commit_message>
Simplificar las plantillas: un archivo por fase y ningún dato repetido
La ficha exprés pasa a ser la primera versión del documento del proyecto,
en el mismo archivo, y desaparece ficha_expres.docx. El cuaderno queda
para los bloques 1, 2 y 5. El guion indica qué plantilla se usa en cada
momento.

Co-Authored-By: Claude Opus 5.5 <noreply@anthropic.com>
</commit_message>
<xml_diff>
--- a/plantillas/cuaderno_ejercicios.docx
+++ b/plantillas/cuaderno_ejercicios.docx
@@ -546,7 +546,7 @@
           <w:sz w:val="24"/>
           <w:szCs w:val="24"/>
         </w:rPr>
-        <w:t xml:space="preserve">Plantillas que usaréis además de este cuaderno</w:t>
+        <w:t xml:space="preserve">Los cuatro archivos del taller, en orden</w:t>
       </w:r>
     </w:p>
     <w:tbl>
@@ -598,7 +598,7 @@
                 <w:sz w:val="20"/>
                 <w:szCs w:val="20"/>
               </w:rPr>
-              <w:t xml:space="preserve">Plantilla</w:t>
+              <w:t xml:space="preserve">Archivo</w:t>
             </w:r>
           </w:p>
         </w:tc>
@@ -662,7 +662,7 @@
                 <w:sz w:val="20"/>
                 <w:szCs w:val="20"/>
               </w:rPr>
-              <w:t xml:space="preserve">Bloque</w:t>
+              <w:t xml:space="preserve">Bloques</w:t>
             </w:r>
           </w:p>
         </w:tc>
@@ -696,7 +696,7 @@
                 <w:sz w:val="20"/>
                 <w:szCs w:val="20"/>
               </w:rPr>
-              <w:t xml:space="preserve">matriz_decision.xlsx</w:t>
+              <w:t xml:space="preserve">cuaderno_ejercicios.docx</w:t>
             </w:r>
           </w:p>
         </w:tc>
@@ -725,7 +725,7 @@
                 <w:sz w:val="20"/>
                 <w:szCs w:val="20"/>
               </w:rPr>
-              <w:t xml:space="preserve">Comparar las tres propuestas y elegir la ganadora (Ejercicio 4)</w:t>
+              <w:t xml:space="preserve">Este cuaderno: generar ideas, elegir las tres mejores propuestas y preparar la defensa</w:t>
             </w:r>
           </w:p>
         </w:tc>
@@ -754,7 +754,7 @@
                 <w:sz w:val="20"/>
                 <w:szCs w:val="20"/>
               </w:rPr>
-              <w:t xml:space="preserve">3</w:t>
+              <w:t xml:space="preserve">1, 2 y 5</w:t>
             </w:r>
           </w:p>
         </w:tc>
@@ -788,7 +788,7 @@
                 <w:sz w:val="20"/>
                 <w:szCs w:val="20"/>
               </w:rPr>
-              <w:t xml:space="preserve">ficha_expres.docx</w:t>
+              <w:t xml:space="preserve">matriz_decision.xlsx</w:t>
             </w:r>
           </w:p>
         </w:tc>
@@ -817,7 +817,7 @@
                 <w:sz w:val="20"/>
                 <w:szCs w:val="20"/>
               </w:rPr>
-              <w:t xml:space="preserve">Ficha de una página de la propuesta ganadora</w:t>
+              <w:t xml:space="preserve">Comparar las tres propuestas y elegir la ganadora</w:t>
             </w:r>
           </w:p>
         </w:tc>
@@ -909,7 +909,7 @@
                 <w:sz w:val="20"/>
                 <w:szCs w:val="20"/>
               </w:rPr>
-              <w:t xml:space="preserve">Documento del proyecto, de dos páginas como máximo</w:t>
+              <w:t xml:space="preserve">La propuesta ganadora por escrito: primero la ficha exprés y después, en el mismo archivo, el documento completo</w:t>
             </w:r>
           </w:p>
         </w:tc>
@@ -938,7 +938,7 @@
                 <w:sz w:val="20"/>
                 <w:szCs w:val="20"/>
               </w:rPr>
-              <w:t xml:space="preserve">4</w:t>
+              <w:t xml:space="preserve">3 y 4</w:t>
             </w:r>
           </w:p>
         </w:tc>
@@ -4829,80 +4829,6 @@
         <w:t xml:space="preserve">Reunid las ideas de SCAMPER y de la provocación, vuestras y de la IA, y quedaos con tres.</w:t>
       </w:r>
     </w:p>
-    <w:p>
-      <w:pPr>
-        <w:keepNext/>
-        <w:spacing w:after="80" w:before="200"/>
-      </w:pPr>
-      <w:r>
-        <w:rPr>
-          <w:rFonts w:ascii="Arial" w:cs="Arial" w:eastAsia="Arial" w:hAnsi="Arial"/>
-          <w:b/>
-          <w:bCs/>
-          <w:color w:val="1F2A30"/>
-          <w:sz w:val="24"/>
-          <w:szCs w:val="24"/>
-        </w:rPr>
-        <w:t xml:space="preserve">Problema</w:t>
-      </w:r>
-    </w:p>
-    <w:tbl>
-      <w:tblPr>
-        <w:tblW w:type="dxa" w:w="9638"/>
-        <w:tblBorders>
-          <w:top w:val="single" w:color="auto" w:sz="4"/>
-          <w:left w:val="single" w:color="auto" w:sz="4"/>
-          <w:bottom w:val="single" w:color="auto" w:sz="4"/>
-          <w:right w:val="single" w:color="auto" w:sz="4"/>
-          <w:insideH w:val="single" w:color="auto" w:sz="4"/>
-          <w:insideV w:val="single" w:color="auto" w:sz="4"/>
-        </w:tblBorders>
-      </w:tblPr>
-      <w:tblGrid>
-        <w:gridCol w:w="9638"/>
-      </w:tblGrid>
-      <w:tr>
-        <w:trPr>
-          <w:trHeight w:val="600" w:hRule="atLeast"/>
-        </w:trPr>
-        <w:tc>
-          <w:tcPr>
-            <w:tcW w:type="dxa" w:w="9638"/>
-            <w:tcBorders>
-              <w:top w:val="single" w:color="BFC5C9" w:sz="4"/>
-              <w:left w:val="single" w:color="BFC5C9" w:sz="4"/>
-              <w:bottom w:val="single" w:color="BFC5C9" w:sz="4"/>
-              <w:right w:val="single" w:color="BFC5C9" w:sz="4"/>
-            </w:tcBorders>
-            <w:shd w:fill="FDEFCC" w:color="auto" w:val="clear"/>
-            <w:tcMar>
-              <w:top w:type="dxa" w:w="80"/>
-              <w:left w:type="dxa" w:w="120"/>
-              <w:bottom w:type="dxa" w:w="80"/>
-              <w:right w:type="dxa" w:w="120"/>
-            </w:tcMar>
-          </w:tcPr>
-          <w:p>
-            <w:r>
-              <w:rPr>
-                <w:rFonts w:ascii="Calibri" w:cs="Calibri" w:eastAsia="Calibri" w:hAnsi="Calibri"/>
-                <w:i/>
-                <w:iCs/>
-                <w:color w:val="6B7780"/>
-                <w:sz w:val="20"/>
-                <w:szCs w:val="20"/>
-              </w:rPr>
-              <w:t xml:space="preserve">El problema del caso, en una frase.</w:t>
-            </w:r>
-          </w:p>
-        </w:tc>
-      </w:tr>
-    </w:tbl>
-    <w:p>
-      <w:pPr>
-        <w:spacing w:after="0"/>
-      </w:pPr>
-    </w:p>
     <w:tbl>
       <w:tblPr>
         <w:tblW w:type="dxa" w:w="9638"/>
@@ -5436,6 +5362,22 @@
         </w:tc>
       </w:tr>
     </w:tbl>
+    <w:p>
+      <w:pPr>
+        <w:spacing w:after="100" w:before="80"/>
+      </w:pPr>
+      <w:r>
+        <w:rPr>
+          <w:rFonts w:ascii="Calibri" w:cs="Calibri" w:eastAsia="Calibri" w:hAnsi="Calibri"/>
+          <w:i/>
+          <w:iCs/>
+          <w:color w:val="6B7780"/>
+          <w:sz w:val="20"/>
+          <w:szCs w:val="20"/>
+        </w:rPr>
+        <w:t xml:space="preserve">Estas tres propuestas son las que llevaréis a la matriz de decisión (matriz_decision.xlsx) en el bloque 3.</w:t>
+      </w:r>
+    </w:p>
     <w:p>
       <w:pPr>
         <w:keepNext/>
@@ -5669,1376 +5611,6 @@
                 <w:szCs w:val="20"/>
               </w:rPr>
               <w:t xml:space="preserve">Problemas que encontramos.</w:t>
-            </w:r>
-          </w:p>
-        </w:tc>
-      </w:tr>
-    </w:tbl>
-    <w:p>
-      <w:r>
-        <w:br w:type="page"/>
-      </w:r>
-    </w:p>
-    <w:p>
-      <w:pPr>
-        <w:spacing w:after="60"/>
-      </w:pPr>
-      <w:r>
-        <w:rPr>
-          <w:rFonts w:ascii="Arial" w:cs="Arial" w:eastAsia="Arial" w:hAnsi="Arial"/>
-          <w:b/>
-          <w:bCs/>
-          <w:color w:val="1F2A30"/>
-          <w:sz w:val="36"/>
-          <w:szCs w:val="36"/>
-        </w:rPr>
-        <w:t xml:space="preserve">Bloque 3. Comparar, decidir y documentar</w:t>
-      </w:r>
-    </w:p>
-    <w:p>
-      <w:pPr>
-        <w:pBdr>
-          <w:bottom w:val="single" w:color="F4A300" w:sz="12" w:space="6"/>
-        </w:pBdr>
-        <w:spacing w:after="200"/>
-      </w:pPr>
-      <w:r>
-        <w:rPr>
-          <w:rFonts w:ascii="Calibri" w:cs="Calibri" w:eastAsia="Calibri" w:hAnsi="Calibri"/>
-          <w:color w:val="6B7780"/>
-          <w:sz w:val="20"/>
-          <w:szCs w:val="20"/>
-        </w:rPr>
-        <w:t xml:space="preserve">Ejercicio 4 y ficha exprés de la propuesta ganadora.</w:t>
-      </w:r>
-    </w:p>
-    <w:p>
-      <w:pPr>
-        <w:keepNext/>
-        <w:spacing w:after="80" w:before="200"/>
-      </w:pPr>
-      <w:r>
-        <w:rPr>
-          <w:rFonts w:ascii="Arial" w:cs="Arial" w:eastAsia="Arial" w:hAnsi="Arial"/>
-          <w:b/>
-          <w:bCs/>
-          <w:color w:val="1F2A30"/>
-          <w:sz w:val="24"/>
-          <w:szCs w:val="24"/>
-        </w:rPr>
-        <w:t xml:space="preserve">Ejercicio 4. Elegir con criterio</w:t>
-      </w:r>
-    </w:p>
-    <w:p>
-      <w:pPr>
-        <w:spacing w:after="100"/>
-      </w:pPr>
-      <w:r>
-        <w:rPr>
-          <w:rFonts w:ascii="Calibri" w:cs="Calibri" w:eastAsia="Calibri" w:hAnsi="Calibri"/>
-          <w:b/>
-          <w:bCs/>
-          <w:sz w:val="22"/>
-          <w:szCs w:val="22"/>
-        </w:rPr>
-        <w:t xml:space="preserve">Plantilla: </w:t>
-      </w:r>
-      <w:r>
-        <w:rPr>
-          <w:rFonts w:ascii="Calibri" w:cs="Calibri" w:eastAsia="Calibri" w:hAnsi="Calibri"/>
-          <w:b/>
-          <w:bCs/>
-          <w:sz w:val="22"/>
-          <w:szCs w:val="22"/>
-        </w:rPr>
-        <w:t xml:space="preserve">matriz_decision.xlsx</w:t>
-      </w:r>
-      <w:r>
-        <w:rPr>
-          <w:rFonts w:ascii="Calibri" w:cs="Calibri" w:eastAsia="Calibri" w:hAnsi="Calibri"/>
-          <w:sz w:val="22"/>
-          <w:szCs w:val="22"/>
-        </w:rPr>
-        <w:t xml:space="preserve">. Ahí anotáis también la decisión y sus razones.</w:t>
-      </w:r>
-    </w:p>
-    <w:p>
-      <w:pPr>
-        <w:spacing w:after="80"/>
-        <w:ind w:left="360" w:hanging="360"/>
-      </w:pPr>
-      <w:r>
-        <w:rPr>
-          <w:rFonts w:ascii="Calibri" w:cs="Calibri" w:eastAsia="Calibri" w:hAnsi="Calibri"/>
-          <w:sz w:val="22"/>
-          <w:szCs w:val="22"/>
-        </w:rPr>
-        <w:t xml:space="preserve">1.	</w:t>
-      </w:r>
-      <w:r>
-        <w:rPr>
-          <w:rFonts w:ascii="Calibri" w:cs="Calibri" w:eastAsia="Calibri" w:hAnsi="Calibri"/>
-          <w:sz w:val="22"/>
-          <w:szCs w:val="22"/>
-        </w:rPr>
-        <w:t xml:space="preserve">Introducid vuestras tres propuestas del bloque 2.</w:t>
-      </w:r>
-    </w:p>
-    <w:p>
-      <w:pPr>
-        <w:spacing w:after="80"/>
-        <w:ind w:left="360" w:hanging="360"/>
-      </w:pPr>
-      <w:r>
-        <w:rPr>
-          <w:rFonts w:ascii="Calibri" w:cs="Calibri" w:eastAsia="Calibri" w:hAnsi="Calibri"/>
-          <w:sz w:val="22"/>
-          <w:szCs w:val="22"/>
-        </w:rPr>
-        <w:t xml:space="preserve">2.	</w:t>
-      </w:r>
-      <w:r>
-        <w:rPr>
-          <w:rFonts w:ascii="Calibri" w:cs="Calibri" w:eastAsia="Calibri" w:hAnsi="Calibri"/>
-          <w:sz w:val="22"/>
-          <w:szCs w:val="22"/>
-        </w:rPr>
-        <w:t xml:space="preserve">Puntuad cada criterio del 1 al 5: impacto (35 %), viabilidad (30 %), bajo coste (20 %, 5 = muy económica) y originalidad (15 %).</w:t>
-      </w:r>
-    </w:p>
-    <w:p>
-      <w:pPr>
-        <w:spacing w:after="80"/>
-        <w:ind w:left="360" w:hanging="360"/>
-      </w:pPr>
-      <w:r>
-        <w:rPr>
-          <w:rFonts w:ascii="Calibri" w:cs="Calibri" w:eastAsia="Calibri" w:hAnsi="Calibri"/>
-          <w:sz w:val="22"/>
-          <w:szCs w:val="22"/>
-        </w:rPr>
-        <w:t xml:space="preserve">3.	</w:t>
-      </w:r>
-      <w:r>
-        <w:rPr>
-          <w:rFonts w:ascii="Calibri" w:cs="Calibri" w:eastAsia="Calibri" w:hAnsi="Calibri"/>
-          <w:sz w:val="22"/>
-          <w:szCs w:val="22"/>
-        </w:rPr>
-        <w:t xml:space="preserve">Ordenad las propuestas por resultado y discutid si la primera os parece realmente la más adecuada.</w:t>
-      </w:r>
-    </w:p>
-    <w:p>
-      <w:pPr>
-        <w:spacing w:after="80"/>
-        <w:ind w:left="360" w:hanging="360"/>
-      </w:pPr>
-      <w:r>
-        <w:rPr>
-          <w:rFonts w:ascii="Calibri" w:cs="Calibri" w:eastAsia="Calibri" w:hAnsi="Calibri"/>
-          <w:sz w:val="22"/>
-          <w:szCs w:val="22"/>
-        </w:rPr>
-        <w:t xml:space="preserve">4.	</w:t>
-      </w:r>
-      <w:r>
-        <w:rPr>
-          <w:rFonts w:ascii="Calibri" w:cs="Calibri" w:eastAsia="Calibri" w:hAnsi="Calibri"/>
-          <w:sz w:val="22"/>
-          <w:szCs w:val="22"/>
-        </w:rPr>
-        <w:t xml:space="preserve">Dad más peso al coste (los pesos siempre suman 100 %) y observad si cambia la clasificación.</w:t>
-      </w:r>
-    </w:p>
-    <w:p>
-      <w:pPr>
-        <w:spacing w:after="80"/>
-        <w:ind w:left="360" w:hanging="360"/>
-      </w:pPr>
-      <w:r>
-        <w:rPr>
-          <w:rFonts w:ascii="Calibri" w:cs="Calibri" w:eastAsia="Calibri" w:hAnsi="Calibri"/>
-          <w:sz w:val="22"/>
-          <w:szCs w:val="22"/>
-        </w:rPr>
-        <w:t xml:space="preserve">5.	</w:t>
-      </w:r>
-      <w:r>
-        <w:rPr>
-          <w:rFonts w:ascii="Calibri" w:cs="Calibri" w:eastAsia="Calibri" w:hAnsi="Calibri"/>
-          <w:sz w:val="22"/>
-          <w:szCs w:val="22"/>
-        </w:rPr>
-        <w:t xml:space="preserve">Pedid a la IA que revise la matriz y comprobad si sus observaciones son correctas.</w:t>
-      </w:r>
-    </w:p>
-    <w:p>
-      <w:pPr>
-        <w:spacing w:after="80"/>
-        <w:ind w:left="360" w:hanging="360"/>
-      </w:pPr>
-      <w:r>
-        <w:rPr>
-          <w:rFonts w:ascii="Calibri" w:cs="Calibri" w:eastAsia="Calibri" w:hAnsi="Calibri"/>
-          <w:sz w:val="22"/>
-          <w:szCs w:val="22"/>
-        </w:rPr>
-        <w:t xml:space="preserve">6.	</w:t>
-      </w:r>
-      <w:r>
-        <w:rPr>
-          <w:rFonts w:ascii="Calibri" w:cs="Calibri" w:eastAsia="Calibri" w:hAnsi="Calibri"/>
-          <w:b/>
-          <w:bCs/>
-          <w:sz w:val="22"/>
-          <w:szCs w:val="22"/>
-        </w:rPr>
-        <w:t xml:space="preserve">Decidid: «Elegimos… porque…».</w:t>
-      </w:r>
-      <w:r>
-        <w:rPr>
-          <w:rFonts w:ascii="Calibri" w:cs="Calibri" w:eastAsia="Calibri" w:hAnsi="Calibri"/>
-          <w:sz w:val="22"/>
-          <w:szCs w:val="22"/>
-        </w:rPr>
-        <w:t xml:space="preserve"> No tiene por qué ser la de mayor puntuación, pero si no lo es, explicad por qué.</w:t>
-      </w:r>
-    </w:p>
-    <w:p>
-      <w:pPr>
-        <w:spacing w:after="0"/>
-      </w:pPr>
-    </w:p>
-    <w:tbl>
-      <w:tblPr>
-        <w:tblW w:type="dxa" w:w="9638"/>
-        <w:tblBorders>
-          <w:top w:val="single" w:color="auto" w:sz="4"/>
-          <w:left w:val="single" w:color="auto" w:sz="4"/>
-          <w:bottom w:val="single" w:color="auto" w:sz="4"/>
-          <w:right w:val="single" w:color="auto" w:sz="4"/>
-          <w:insideH w:val="single" w:color="auto" w:sz="4"/>
-          <w:insideV w:val="single" w:color="auto" w:sz="4"/>
-        </w:tblBorders>
-      </w:tblPr>
-      <w:tblGrid>
-        <w:gridCol w:w="9638"/>
-      </w:tblGrid>
-      <w:tr>
-        <w:tc>
-          <w:tcPr>
-            <w:tcW w:type="dxa" w:w="9638"/>
-            <w:tcBorders>
-              <w:top w:val="single" w:color="BFC5C9" w:sz="4"/>
-              <w:left w:val="single" w:color="0F7C70" w:sz="24"/>
-              <w:bottom w:val="single" w:color="BFC5C9" w:sz="4"/>
-              <w:right w:val="single" w:color="BFC5C9" w:sz="4"/>
-            </w:tcBorders>
-            <w:shd w:fill="D5ECE9" w:color="auto" w:val="clear"/>
-            <w:tcMar>
-              <w:top w:type="dxa" w:w="80"/>
-              <w:left w:type="dxa" w:w="120"/>
-              <w:bottom w:type="dxa" w:w="80"/>
-              <w:right w:type="dxa" w:w="120"/>
-            </w:tcMar>
-          </w:tcPr>
-          <w:p>
-            <w:pPr>
-              <w:spacing w:after="80"/>
-            </w:pPr>
-            <w:r>
-              <w:rPr>
-                <w:rFonts w:ascii="Calibri" w:cs="Calibri" w:eastAsia="Calibri" w:hAnsi="Calibri"/>
-                <w:b/>
-                <w:bCs/>
-                <w:color w:val="0F7C70"/>
-                <w:sz w:val="20"/>
-                <w:szCs w:val="20"/>
-              </w:rPr>
-              <w:t xml:space="preserve">Prompt para que la IA revise la matriz</w:t>
-            </w:r>
-          </w:p>
-          <w:p>
-            <w:r>
-              <w:rPr>
-                <w:rFonts w:ascii="Consolas" w:cs="Consolas" w:eastAsia="Consolas" w:hAnsi="Consolas"/>
-                <w:sz w:val="18"/>
-                <w:szCs w:val="18"/>
-              </w:rPr>
-              <w:t xml:space="preserve">Te paso una matriz de decisión con tres propuestas, cuatro criterios</w:t>
-            </w:r>
-          </w:p>
-          <w:p>
-            <w:r>
-              <w:rPr>
-                <w:rFonts w:ascii="Consolas" w:cs="Consolas" w:eastAsia="Consolas" w:hAnsi="Consolas"/>
-                <w:sz w:val="18"/>
-                <w:szCs w:val="18"/>
-              </w:rPr>
-              <w:t xml:space="preserve">puntuados del 1 al 5 y sus pesos: [pegar la tabla con los pesos].</w:t>
-            </w:r>
-          </w:p>
-          <w:p>
-            <w:r>
-              <w:rPr>
-                <w:rFonts w:ascii="Consolas" w:cs="Consolas" w:eastAsia="Consolas" w:hAnsi="Consolas"/>
-                <w:sz w:val="18"/>
-                <w:szCs w:val="18"/>
-              </w:rPr>
-              <w:t xml:space="preserve">Revísala: comprueba si los cálculos son correctos, si alguna</w:t>
-            </w:r>
-          </w:p>
-          <w:p>
-            <w:r>
-              <w:rPr>
-                <w:rFonts w:ascii="Consolas" w:cs="Consolas" w:eastAsia="Consolas" w:hAnsi="Consolas"/>
-                <w:sz w:val="18"/>
-                <w:szCs w:val="18"/>
-              </w:rPr>
-              <w:t xml:space="preserve">puntuación parece incoherente con la descripción de la propuesta</w:t>
-            </w:r>
-          </w:p>
-          <w:p>
-            <w:r>
-              <w:rPr>
-                <w:rFonts w:ascii="Consolas" w:cs="Consolas" w:eastAsia="Consolas" w:hAnsi="Consolas"/>
-                <w:sz w:val="18"/>
-                <w:szCs w:val="18"/>
-              </w:rPr>
-              <w:t xml:space="preserve">y si falta algún criterio importante. Justifica cada observación.</w:t>
-            </w:r>
-          </w:p>
-        </w:tc>
-      </w:tr>
-    </w:tbl>
-    <w:p>
-      <w:pPr>
-        <w:keepNext/>
-        <w:spacing w:after="80" w:before="200"/>
-      </w:pPr>
-      <w:r>
-        <w:rPr>
-          <w:rFonts w:ascii="Arial" w:cs="Arial" w:eastAsia="Arial" w:hAnsi="Arial"/>
-          <w:b/>
-          <w:bCs/>
-          <w:color w:val="1F2A30"/>
-          <w:sz w:val="24"/>
-          <w:szCs w:val="24"/>
-        </w:rPr>
-        <w:t xml:space="preserve">Ficha exprés de la propuesta ganadora</w:t>
-      </w:r>
-    </w:p>
-    <w:p>
-      <w:pPr>
-        <w:spacing w:after="100"/>
-      </w:pPr>
-      <w:r>
-        <w:rPr>
-          <w:rFonts w:ascii="Calibri" w:cs="Calibri" w:eastAsia="Calibri" w:hAnsi="Calibri"/>
-          <w:b/>
-          <w:bCs/>
-          <w:sz w:val="22"/>
-          <w:szCs w:val="22"/>
-        </w:rPr>
-        <w:t xml:space="preserve">Plantilla: </w:t>
-      </w:r>
-      <w:r>
-        <w:rPr>
-          <w:rFonts w:ascii="Calibri" w:cs="Calibri" w:eastAsia="Calibri" w:hAnsi="Calibri"/>
-          <w:b/>
-          <w:bCs/>
-          <w:sz w:val="22"/>
-          <w:szCs w:val="22"/>
-        </w:rPr>
-        <w:t xml:space="preserve">ficha_expres.docx</w:t>
-      </w:r>
-      <w:r>
-        <w:rPr>
-          <w:rFonts w:ascii="Calibri" w:cs="Calibri" w:eastAsia="Calibri" w:hAnsi="Calibri"/>
-          <w:sz w:val="22"/>
-          <w:szCs w:val="22"/>
-        </w:rPr>
-        <w:t xml:space="preserve">. La pedís a la IA con el prompt de la plantilla y marcáis tres cosas que cambiaríais: algo que sobra, algo que falta y algo que no es cierto o no está justificado. Esta ficha es el borrador del documento del bloque 4.</w:t>
-      </w:r>
-    </w:p>
-    <w:p>
-      <w:pPr>
-        <w:keepNext/>
-        <w:spacing w:after="80" w:before="200"/>
-      </w:pPr>
-      <w:r>
-        <w:rPr>
-          <w:rFonts w:ascii="Arial" w:cs="Arial" w:eastAsia="Arial" w:hAnsi="Arial"/>
-          <w:b/>
-          <w:bCs/>
-          <w:color w:val="1F2A30"/>
-          <w:sz w:val="24"/>
-          <w:szCs w:val="24"/>
-        </w:rPr>
-        <w:t xml:space="preserve">Síntesis</w:t>
-      </w:r>
-    </w:p>
-    <w:p>
-      <w:pPr>
-        <w:spacing w:after="100"/>
-      </w:pPr>
-      <w:r>
-        <w:rPr>
-          <w:rFonts w:ascii="Calibri" w:cs="Calibri" w:eastAsia="Calibri" w:hAnsi="Calibri"/>
-          <w:b/>
-          <w:bCs/>
-          <w:sz w:val="22"/>
-          <w:szCs w:val="22"/>
-        </w:rPr>
-        <w:t xml:space="preserve">Detectar → idear → comparar → decidir → documentar</w:t>
-      </w:r>
-    </w:p>
-    <w:tbl>
-      <w:tblPr>
-        <w:tblW w:type="dxa" w:w="9638"/>
-        <w:tblBorders>
-          <w:top w:val="single" w:color="auto" w:sz="4"/>
-          <w:left w:val="single" w:color="auto" w:sz="4"/>
-          <w:bottom w:val="single" w:color="auto" w:sz="4"/>
-          <w:right w:val="single" w:color="auto" w:sz="4"/>
-          <w:insideH w:val="single" w:color="auto" w:sz="4"/>
-          <w:insideV w:val="single" w:color="auto" w:sz="4"/>
-        </w:tblBorders>
-      </w:tblPr>
-      <w:tblGrid>
-        <w:gridCol w:w="9638"/>
-      </w:tblGrid>
-      <w:tr>
-        <w:trPr>
-          <w:trHeight w:val="800" w:hRule="atLeast"/>
-        </w:trPr>
-        <w:tc>
-          <w:tcPr>
-            <w:tcW w:type="dxa" w:w="9638"/>
-            <w:tcBorders>
-              <w:top w:val="single" w:color="BFC5C9" w:sz="4"/>
-              <w:left w:val="single" w:color="BFC5C9" w:sz="4"/>
-              <w:bottom w:val="single" w:color="BFC5C9" w:sz="4"/>
-              <w:right w:val="single" w:color="BFC5C9" w:sz="4"/>
-            </w:tcBorders>
-            <w:shd w:fill="FDEFCC" w:color="auto" w:val="clear"/>
-            <w:tcMar>
-              <w:top w:type="dxa" w:w="80"/>
-              <w:left w:type="dxa" w:w="120"/>
-              <w:bottom w:type="dxa" w:w="80"/>
-              <w:right w:type="dxa" w:w="120"/>
-            </w:tcMar>
-          </w:tcPr>
-          <w:p>
-            <w:r>
-              <w:rPr>
-                <w:rFonts w:ascii="Calibri" w:cs="Calibri" w:eastAsia="Calibri" w:hAnsi="Calibri"/>
-                <w:i/>
-                <w:iCs/>
-                <w:color w:val="6B7780"/>
-                <w:sz w:val="20"/>
-                <w:szCs w:val="20"/>
-              </w:rPr>
-              <w:t xml:space="preserve">¿Qué paso de la secuencia os ha costado más hasta ahora y por qué? Una frase.</w:t>
-            </w:r>
-          </w:p>
-        </w:tc>
-      </w:tr>
-    </w:tbl>
-    <w:p>
-      <w:r>
-        <w:br w:type="page"/>
-      </w:r>
-    </w:p>
-    <w:p>
-      <w:pPr>
-        <w:spacing w:after="60"/>
-      </w:pPr>
-      <w:r>
-        <w:rPr>
-          <w:rFonts w:ascii="Arial" w:cs="Arial" w:eastAsia="Arial" w:hAnsi="Arial"/>
-          <w:b/>
-          <w:bCs/>
-          <w:color w:val="1F2A30"/>
-          <w:sz w:val="36"/>
-          <w:szCs w:val="36"/>
-        </w:rPr>
-        <w:t xml:space="preserve">Bloque 4. Desarrollo de la propuesta ganadora</w:t>
-      </w:r>
-    </w:p>
-    <w:p>
-      <w:pPr>
-        <w:pBdr>
-          <w:bottom w:val="single" w:color="F4A300" w:sz="12" w:space="6"/>
-        </w:pBdr>
-        <w:spacing w:after="200"/>
-      </w:pPr>
-      <w:r>
-        <w:rPr>
-          <w:rFonts w:ascii="Calibri" w:cs="Calibri" w:eastAsia="Calibri" w:hAnsi="Calibri"/>
-          <w:color w:val="6B7780"/>
-          <w:sz w:val="20"/>
-          <w:szCs w:val="20"/>
-        </w:rPr>
-        <w:t xml:space="preserve">Convertir la propuesta en un proyecto defendible.</w:t>
-      </w:r>
-    </w:p>
-    <w:p>
-      <w:pPr>
-        <w:keepNext/>
-        <w:spacing w:after="80" w:before="200"/>
-      </w:pPr>
-      <w:r>
-        <w:rPr>
-          <w:rFonts w:ascii="Arial" w:cs="Arial" w:eastAsia="Arial" w:hAnsi="Arial"/>
-          <w:b/>
-          <w:bCs/>
-          <w:color w:val="1F2A30"/>
-          <w:sz w:val="24"/>
-          <w:szCs w:val="24"/>
-        </w:rPr>
-        <w:t xml:space="preserve">Preguntas difíciles antes de seguir</w:t>
-      </w:r>
-    </w:p>
-    <w:p>
-      <w:pPr>
-        <w:spacing w:after="100"/>
-      </w:pPr>
-      <w:r>
-        <w:rPr>
-          <w:rFonts w:ascii="Calibri" w:cs="Calibri" w:eastAsia="Calibri" w:hAnsi="Calibri"/>
-          <w:sz w:val="22"/>
-          <w:szCs w:val="22"/>
-        </w:rPr>
-        <w:t xml:space="preserve">Os juntáis con otra pareja. Le explicáis vuestra propuesta en un minuto, con la ficha exprés delante, y os hace dos preguntas difíciles (¿cuánto cuesta?, ¿quién se encarga?, ¿qué pasa si alguien no lo usa?, ¿cómo sabremos si funciona?). Después, al revés.</w:t>
-      </w:r>
-    </w:p>
-    <w:tbl>
-      <w:tblPr>
-        <w:tblW w:type="dxa" w:w="9638"/>
-        <w:tblBorders>
-          <w:top w:val="single" w:color="auto" w:sz="4"/>
-          <w:left w:val="single" w:color="auto" w:sz="4"/>
-          <w:bottom w:val="single" w:color="auto" w:sz="4"/>
-          <w:right w:val="single" w:color="auto" w:sz="4"/>
-          <w:insideH w:val="single" w:color="auto" w:sz="4"/>
-          <w:insideV w:val="single" w:color="auto" w:sz="4"/>
-        </w:tblBorders>
-      </w:tblPr>
-      <w:tblGrid>
-        <w:gridCol w:w="6638"/>
-        <w:gridCol w:w="3000"/>
-      </w:tblGrid>
-      <w:tr>
-        <w:trPr>
-          <w:tblHeader/>
-        </w:trPr>
-        <w:tc>
-          <w:tcPr>
-            <w:tcW w:type="dxa" w:w="6638"/>
-            <w:tcBorders>
-              <w:top w:val="single" w:color="BFC5C9" w:sz="4"/>
-              <w:left w:val="single" w:color="BFC5C9" w:sz="4"/>
-              <w:bottom w:val="single" w:color="BFC5C9" w:sz="4"/>
-              <w:right w:val="single" w:color="BFC5C9" w:sz="4"/>
-            </w:tcBorders>
-            <w:shd w:fill="1F2A30" w:color="auto" w:val="clear"/>
-            <w:tcMar>
-              <w:top w:type="dxa" w:w="80"/>
-              <w:left w:type="dxa" w:w="120"/>
-              <w:bottom w:type="dxa" w:w="80"/>
-              <w:right w:type="dxa" w:w="120"/>
-            </w:tcMar>
-            <w:vAlign w:val="center"/>
-          </w:tcPr>
-          <w:p>
-            <w:r>
-              <w:rPr>
-                <w:rFonts w:ascii="Calibri" w:cs="Calibri" w:eastAsia="Calibri" w:hAnsi="Calibri"/>
-                <w:b/>
-                <w:bCs/>
-                <w:color w:val="FFFFFF"/>
-                <w:sz w:val="20"/>
-                <w:szCs w:val="20"/>
-              </w:rPr>
-              <w:t xml:space="preserve">Pregunta que nos han hecho</w:t>
-            </w:r>
-          </w:p>
-        </w:tc>
-        <w:tc>
-          <w:tcPr>
-            <w:tcW w:type="dxa" w:w="3000"/>
-            <w:tcBorders>
-              <w:top w:val="single" w:color="BFC5C9" w:sz="4"/>
-              <w:left w:val="single" w:color="BFC5C9" w:sz="4"/>
-              <w:bottom w:val="single" w:color="BFC5C9" w:sz="4"/>
-              <w:right w:val="single" w:color="BFC5C9" w:sz="4"/>
-            </w:tcBorders>
-            <w:shd w:fill="1F2A30" w:color="auto" w:val="clear"/>
-            <w:tcMar>
-              <w:top w:type="dxa" w:w="80"/>
-              <w:left w:type="dxa" w:w="120"/>
-              <w:bottom w:type="dxa" w:w="80"/>
-              <w:right w:type="dxa" w:w="120"/>
-            </w:tcMar>
-            <w:vAlign w:val="center"/>
-          </w:tcPr>
-          <w:p>
-            <w:r>
-              <w:rPr>
-                <w:rFonts w:ascii="Calibri" w:cs="Calibri" w:eastAsia="Calibri" w:hAnsi="Calibri"/>
-                <w:b/>
-                <w:bCs/>
-                <w:color w:val="FFFFFF"/>
-                <w:sz w:val="20"/>
-                <w:szCs w:val="20"/>
-              </w:rPr>
-              <w:t xml:space="preserve">¿Supimos responder?</w:t>
-            </w:r>
-          </w:p>
-        </w:tc>
-      </w:tr>
-      <w:tr>
-        <w:trPr>
-          <w:trHeight w:val="600" w:hRule="atLeast"/>
-        </w:trPr>
-        <w:tc>
-          <w:tcPr>
-            <w:tcW w:type="dxa" w:w="6638"/>
-            <w:tcBorders>
-              <w:top w:val="single" w:color="BFC5C9" w:sz="4"/>
-              <w:left w:val="single" w:color="BFC5C9" w:sz="4"/>
-              <w:bottom w:val="single" w:color="BFC5C9" w:sz="4"/>
-              <w:right w:val="single" w:color="BFC5C9" w:sz="4"/>
-            </w:tcBorders>
-            <w:shd w:fill="FDEFCC" w:color="auto" w:val="clear"/>
-            <w:tcMar>
-              <w:top w:type="dxa" w:w="80"/>
-              <w:left w:type="dxa" w:w="120"/>
-              <w:bottom w:type="dxa" w:w="80"/>
-              <w:right w:type="dxa" w:w="120"/>
-            </w:tcMar>
-          </w:tcPr>
-          <w:p>
-            <w:r>
-              <w:rPr>
-                <w:rFonts w:ascii="Calibri" w:cs="Calibri" w:eastAsia="Calibri" w:hAnsi="Calibri"/>
-                <w:i/>
-                <w:iCs/>
-                <w:color w:val="6B7780"/>
-                <w:sz w:val="20"/>
-                <w:szCs w:val="20"/>
-              </w:rPr>
-              <w:t xml:space="preserve"/>
-            </w:r>
-          </w:p>
-        </w:tc>
-        <w:tc>
-          <w:tcPr>
-            <w:tcW w:type="dxa" w:w="3000"/>
-            <w:tcBorders>
-              <w:top w:val="single" w:color="BFC5C9" w:sz="4"/>
-              <w:left w:val="single" w:color="BFC5C9" w:sz="4"/>
-              <w:bottom w:val="single" w:color="BFC5C9" w:sz="4"/>
-              <w:right w:val="single" w:color="BFC5C9" w:sz="4"/>
-            </w:tcBorders>
-            <w:shd w:fill="FDEFCC" w:color="auto" w:val="clear"/>
-            <w:tcMar>
-              <w:top w:type="dxa" w:w="80"/>
-              <w:left w:type="dxa" w:w="120"/>
-              <w:bottom w:type="dxa" w:w="80"/>
-              <w:right w:type="dxa" w:w="120"/>
-            </w:tcMar>
-          </w:tcPr>
-          <w:p>
-            <w:r>
-              <w:rPr>
-                <w:rFonts w:ascii="Calibri" w:cs="Calibri" w:eastAsia="Calibri" w:hAnsi="Calibri"/>
-                <w:i/>
-                <w:iCs/>
-                <w:color w:val="6B7780"/>
-                <w:sz w:val="20"/>
-                <w:szCs w:val="20"/>
-              </w:rPr>
-              <w:t xml:space="preserve">Sí o no</w:t>
-            </w:r>
-          </w:p>
-        </w:tc>
-      </w:tr>
-      <w:tr>
-        <w:trPr>
-          <w:trHeight w:val="600" w:hRule="atLeast"/>
-        </w:trPr>
-        <w:tc>
-          <w:tcPr>
-            <w:tcW w:type="dxa" w:w="6638"/>
-            <w:tcBorders>
-              <w:top w:val="single" w:color="BFC5C9" w:sz="4"/>
-              <w:left w:val="single" w:color="BFC5C9" w:sz="4"/>
-              <w:bottom w:val="single" w:color="BFC5C9" w:sz="4"/>
-              <w:right w:val="single" w:color="BFC5C9" w:sz="4"/>
-            </w:tcBorders>
-            <w:shd w:fill="FDEFCC" w:color="auto" w:val="clear"/>
-            <w:tcMar>
-              <w:top w:type="dxa" w:w="80"/>
-              <w:left w:type="dxa" w:w="120"/>
-              <w:bottom w:type="dxa" w:w="80"/>
-              <w:right w:type="dxa" w:w="120"/>
-            </w:tcMar>
-          </w:tcPr>
-          <w:p>
-            <w:r>
-              <w:rPr>
-                <w:rFonts w:ascii="Calibri" w:cs="Calibri" w:eastAsia="Calibri" w:hAnsi="Calibri"/>
-                <w:i/>
-                <w:iCs/>
-                <w:color w:val="6B7780"/>
-                <w:sz w:val="20"/>
-                <w:szCs w:val="20"/>
-              </w:rPr>
-              <w:t xml:space="preserve"/>
-            </w:r>
-          </w:p>
-        </w:tc>
-        <w:tc>
-          <w:tcPr>
-            <w:tcW w:type="dxa" w:w="3000"/>
-            <w:tcBorders>
-              <w:top w:val="single" w:color="BFC5C9" w:sz="4"/>
-              <w:left w:val="single" w:color="BFC5C9" w:sz="4"/>
-              <w:bottom w:val="single" w:color="BFC5C9" w:sz="4"/>
-              <w:right w:val="single" w:color="BFC5C9" w:sz="4"/>
-            </w:tcBorders>
-            <w:shd w:fill="FDEFCC" w:color="auto" w:val="clear"/>
-            <w:tcMar>
-              <w:top w:type="dxa" w:w="80"/>
-              <w:left w:type="dxa" w:w="120"/>
-              <w:bottom w:type="dxa" w:w="80"/>
-              <w:right w:type="dxa" w:w="120"/>
-            </w:tcMar>
-          </w:tcPr>
-          <w:p>
-            <w:r>
-              <w:rPr>
-                <w:rFonts w:ascii="Calibri" w:cs="Calibri" w:eastAsia="Calibri" w:hAnsi="Calibri"/>
-                <w:i/>
-                <w:iCs/>
-                <w:color w:val="6B7780"/>
-                <w:sz w:val="20"/>
-                <w:szCs w:val="20"/>
-              </w:rPr>
-              <w:t xml:space="preserve">Sí o no</w:t>
-            </w:r>
-          </w:p>
-        </w:tc>
-      </w:tr>
-    </w:tbl>
-    <w:p>
-      <w:pPr>
-        <w:spacing w:after="100" w:before="80"/>
-      </w:pPr>
-      <w:r>
-        <w:rPr>
-          <w:rFonts w:ascii="Calibri" w:cs="Calibri" w:eastAsia="Calibri" w:hAnsi="Calibri"/>
-          <w:i/>
-          <w:iCs/>
-          <w:color w:val="6B7780"/>
-          <w:sz w:val="20"/>
-          <w:szCs w:val="20"/>
-        </w:rPr>
-        <w:t xml:space="preserve">Las que no supisteis responder son lo primero que tiene que resolver el documento: pasadlas a su última página.</w:t>
-      </w:r>
-    </w:p>
-    <w:p>
-      <w:pPr>
-        <w:keepNext/>
-        <w:spacing w:after="80" w:before="200"/>
-      </w:pPr>
-      <w:r>
-        <w:rPr>
-          <w:rFonts w:ascii="Arial" w:cs="Arial" w:eastAsia="Arial" w:hAnsi="Arial"/>
-          <w:b/>
-          <w:bCs/>
-          <w:color w:val="1F2A30"/>
-          <w:sz w:val="24"/>
-          <w:szCs w:val="24"/>
-        </w:rPr>
-        <w:t xml:space="preserve">Lo que vais a preparar</w:t>
-      </w:r>
-    </w:p>
-    <w:tbl>
-      <w:tblPr>
-        <w:tblW w:type="dxa" w:w="9638"/>
-        <w:tblBorders>
-          <w:top w:val="single" w:color="auto" w:sz="4"/>
-          <w:left w:val="single" w:color="auto" w:sz="4"/>
-          <w:bottom w:val="single" w:color="auto" w:sz="4"/>
-          <w:right w:val="single" w:color="auto" w:sz="4"/>
-          <w:insideH w:val="single" w:color="auto" w:sz="4"/>
-          <w:insideV w:val="single" w:color="auto" w:sz="4"/>
-        </w:tblBorders>
-      </w:tblPr>
-      <w:tblGrid>
-        <w:gridCol w:w="2600"/>
-        <w:gridCol w:w="2900"/>
-        <w:gridCol w:w="4138"/>
-      </w:tblGrid>
-      <w:tr>
-        <w:trPr>
-          <w:tblHeader/>
-        </w:trPr>
-        <w:tc>
-          <w:tcPr>
-            <w:tcW w:type="dxa" w:w="2600"/>
-            <w:tcBorders>
-              <w:top w:val="single" w:color="BFC5C9" w:sz="4"/>
-              <w:left w:val="single" w:color="BFC5C9" w:sz="4"/>
-              <w:bottom w:val="single" w:color="BFC5C9" w:sz="4"/>
-              <w:right w:val="single" w:color="BFC5C9" w:sz="4"/>
-            </w:tcBorders>
-            <w:shd w:fill="1F2A30" w:color="auto" w:val="clear"/>
-            <w:tcMar>
-              <w:top w:type="dxa" w:w="80"/>
-              <w:left w:type="dxa" w:w="120"/>
-              <w:bottom w:type="dxa" w:w="80"/>
-              <w:right w:type="dxa" w:w="120"/>
-            </w:tcMar>
-            <w:vAlign w:val="center"/>
-          </w:tcPr>
-          <w:p>
-            <w:r>
-              <w:rPr>
-                <w:rFonts w:ascii="Calibri" w:cs="Calibri" w:eastAsia="Calibri" w:hAnsi="Calibri"/>
-                <w:b/>
-                <w:bCs/>
-                <w:color w:val="FFFFFF"/>
-                <w:sz w:val="20"/>
-                <w:szCs w:val="20"/>
-              </w:rPr>
-              <w:t xml:space="preserve">Qué</w:t>
-            </w:r>
-          </w:p>
-        </w:tc>
-        <w:tc>
-          <w:tcPr>
-            <w:tcW w:type="dxa" w:w="2900"/>
-            <w:tcBorders>
-              <w:top w:val="single" w:color="BFC5C9" w:sz="4"/>
-              <w:left w:val="single" w:color="BFC5C9" w:sz="4"/>
-              <w:bottom w:val="single" w:color="BFC5C9" w:sz="4"/>
-              <w:right w:val="single" w:color="BFC5C9" w:sz="4"/>
-            </w:tcBorders>
-            <w:shd w:fill="1F2A30" w:color="auto" w:val="clear"/>
-            <w:tcMar>
-              <w:top w:type="dxa" w:w="80"/>
-              <w:left w:type="dxa" w:w="120"/>
-              <w:bottom w:type="dxa" w:w="80"/>
-              <w:right w:type="dxa" w:w="120"/>
-            </w:tcMar>
-            <w:vAlign w:val="center"/>
-          </w:tcPr>
-          <w:p>
-            <w:r>
-              <w:rPr>
-                <w:rFonts w:ascii="Calibri" w:cs="Calibri" w:eastAsia="Calibri" w:hAnsi="Calibri"/>
-                <w:b/>
-                <w:bCs/>
-                <w:color w:val="FFFFFF"/>
-                <w:sz w:val="20"/>
-                <w:szCs w:val="20"/>
-              </w:rPr>
-              <w:t xml:space="preserve">Plantilla</w:t>
-            </w:r>
-          </w:p>
-        </w:tc>
-        <w:tc>
-          <w:tcPr>
-            <w:tcW w:type="dxa" w:w="4138"/>
-            <w:tcBorders>
-              <w:top w:val="single" w:color="BFC5C9" w:sz="4"/>
-              <w:left w:val="single" w:color="BFC5C9" w:sz="4"/>
-              <w:bottom w:val="single" w:color="BFC5C9" w:sz="4"/>
-              <w:right w:val="single" w:color="BFC5C9" w:sz="4"/>
-            </w:tcBorders>
-            <w:shd w:fill="1F2A30" w:color="auto" w:val="clear"/>
-            <w:tcMar>
-              <w:top w:type="dxa" w:w="80"/>
-              <w:left w:type="dxa" w:w="120"/>
-              <w:bottom w:type="dxa" w:w="80"/>
-              <w:right w:type="dxa" w:w="120"/>
-            </w:tcMar>
-            <w:vAlign w:val="center"/>
-          </w:tcPr>
-          <w:p>
-            <w:r>
-              <w:rPr>
-                <w:rFonts w:ascii="Calibri" w:cs="Calibri" w:eastAsia="Calibri" w:hAnsi="Calibri"/>
-                <w:b/>
-                <w:bCs/>
-                <w:color w:val="FFFFFF"/>
-                <w:sz w:val="20"/>
-                <w:szCs w:val="20"/>
-              </w:rPr>
-              <w:t xml:space="preserve">Clave</w:t>
-            </w:r>
-          </w:p>
-        </w:tc>
-      </w:tr>
-      <w:tr>
-        <w:trPr>
-          <w:trHeight w:val="500" w:hRule="atLeast"/>
-        </w:trPr>
-        <w:tc>
-          <w:tcPr>
-            <w:tcW w:type="dxa" w:w="2600"/>
-            <w:tcBorders>
-              <w:top w:val="single" w:color="BFC5C9" w:sz="4"/>
-              <w:left w:val="single" w:color="BFC5C9" w:sz="4"/>
-              <w:bottom w:val="single" w:color="BFC5C9" w:sz="4"/>
-              <w:right w:val="single" w:color="BFC5C9" w:sz="4"/>
-            </w:tcBorders>
-            <w:tcMar>
-              <w:top w:type="dxa" w:w="80"/>
-              <w:left w:type="dxa" w:w="120"/>
-              <w:bottom w:type="dxa" w:w="80"/>
-              <w:right w:type="dxa" w:w="120"/>
-            </w:tcMar>
-          </w:tcPr>
-          <w:p>
-            <w:r>
-              <w:rPr>
-                <w:rFonts w:ascii="Calibri" w:cs="Calibri" w:eastAsia="Calibri" w:hAnsi="Calibri"/>
-                <w:b/>
-                <w:bCs/>
-                <w:sz w:val="20"/>
-                <w:szCs w:val="20"/>
-              </w:rPr>
-              <w:t xml:space="preserve">Documento del proyecto</w:t>
-            </w:r>
-          </w:p>
-        </w:tc>
-        <w:tc>
-          <w:tcPr>
-            <w:tcW w:type="dxa" w:w="2900"/>
-            <w:tcBorders>
-              <w:top w:val="single" w:color="BFC5C9" w:sz="4"/>
-              <w:left w:val="single" w:color="BFC5C9" w:sz="4"/>
-              <w:bottom w:val="single" w:color="BFC5C9" w:sz="4"/>
-              <w:right w:val="single" w:color="BFC5C9" w:sz="4"/>
-            </w:tcBorders>
-            <w:tcMar>
-              <w:top w:type="dxa" w:w="80"/>
-              <w:left w:type="dxa" w:w="120"/>
-              <w:bottom w:type="dxa" w:w="80"/>
-              <w:right w:type="dxa" w:w="120"/>
-            </w:tcMar>
-          </w:tcPr>
-          <w:p>
-            <w:r>
-              <w:rPr>
-                <w:rFonts w:ascii="Calibri" w:cs="Calibri" w:eastAsia="Calibri" w:hAnsi="Calibri"/>
-                <w:b w:val="false"/>
-                <w:bCs w:val="false"/>
-                <w:sz w:val="20"/>
-                <w:szCs w:val="20"/>
-              </w:rPr>
-              <w:t xml:space="preserve">documento_proyecto.docx</w:t>
-            </w:r>
-          </w:p>
-        </w:tc>
-        <w:tc>
-          <w:tcPr>
-            <w:tcW w:type="dxa" w:w="4138"/>
-            <w:tcBorders>
-              <w:top w:val="single" w:color="BFC5C9" w:sz="4"/>
-              <w:left w:val="single" w:color="BFC5C9" w:sz="4"/>
-              <w:bottom w:val="single" w:color="BFC5C9" w:sz="4"/>
-              <w:right w:val="single" w:color="BFC5C9" w:sz="4"/>
-            </w:tcBorders>
-            <w:tcMar>
-              <w:top w:type="dxa" w:w="80"/>
-              <w:left w:type="dxa" w:w="120"/>
-              <w:bottom w:type="dxa" w:w="80"/>
-              <w:right w:type="dxa" w:w="120"/>
-            </w:tcMar>
-          </w:tcPr>
-          <w:p>
-            <w:r>
-              <w:rPr>
-                <w:rFonts w:ascii="Calibri" w:cs="Calibri" w:eastAsia="Calibri" w:hAnsi="Calibri"/>
-                <w:b w:val="false"/>
-                <w:bCs w:val="false"/>
-                <w:sz w:val="20"/>
-                <w:szCs w:val="20"/>
-              </w:rPr>
-              <w:t xml:space="preserve">Siete apartados, máximo dos páginas. Cada apartado lo revisáis: qué sobra, qué falta y qué no es cierto.</w:t>
-            </w:r>
-          </w:p>
-        </w:tc>
-      </w:tr>
-      <w:tr>
-        <w:trPr>
-          <w:trHeight w:val="500" w:hRule="atLeast"/>
-        </w:trPr>
-        <w:tc>
-          <w:tcPr>
-            <w:tcW w:type="dxa" w:w="2600"/>
-            <w:tcBorders>
-              <w:top w:val="single" w:color="BFC5C9" w:sz="4"/>
-              <w:left w:val="single" w:color="BFC5C9" w:sz="4"/>
-              <w:bottom w:val="single" w:color="BFC5C9" w:sz="4"/>
-              <w:right w:val="single" w:color="BFC5C9" w:sz="4"/>
-            </w:tcBorders>
-            <w:tcMar>
-              <w:top w:type="dxa" w:w="80"/>
-              <w:left w:type="dxa" w:w="120"/>
-              <w:bottom w:type="dxa" w:w="80"/>
-              <w:right w:type="dxa" w:w="120"/>
-            </w:tcMar>
-          </w:tcPr>
-          <w:p>
-            <w:r>
-              <w:rPr>
-                <w:rFonts w:ascii="Calibri" w:cs="Calibri" w:eastAsia="Calibri" w:hAnsi="Calibri"/>
-                <w:b/>
-                <w:bCs/>
-                <w:sz w:val="20"/>
-                <w:szCs w:val="20"/>
-              </w:rPr>
-              <w:t xml:space="preserve">Dos indicadores</w:t>
-            </w:r>
-          </w:p>
-        </w:tc>
-        <w:tc>
-          <w:tcPr>
-            <w:tcW w:type="dxa" w:w="2900"/>
-            <w:tcBorders>
-              <w:top w:val="single" w:color="BFC5C9" w:sz="4"/>
-              <w:left w:val="single" w:color="BFC5C9" w:sz="4"/>
-              <w:bottom w:val="single" w:color="BFC5C9" w:sz="4"/>
-              <w:right w:val="single" w:color="BFC5C9" w:sz="4"/>
-            </w:tcBorders>
-            <w:tcMar>
-              <w:top w:type="dxa" w:w="80"/>
-              <w:left w:type="dxa" w:w="120"/>
-              <w:bottom w:type="dxa" w:w="80"/>
-              <w:right w:type="dxa" w:w="120"/>
-            </w:tcMar>
-          </w:tcPr>
-          <w:p>
-            <w:r>
-              <w:rPr>
-                <w:rFonts w:ascii="Calibri" w:cs="Calibri" w:eastAsia="Calibri" w:hAnsi="Calibri"/>
-                <w:b w:val="false"/>
-                <w:bCs w:val="false"/>
-                <w:sz w:val="20"/>
-                <w:szCs w:val="20"/>
-              </w:rPr>
-              <w:t xml:space="preserve">documento_proyecto.docx, apartado 4</w:t>
-            </w:r>
-          </w:p>
-        </w:tc>
-        <w:tc>
-          <w:tcPr>
-            <w:tcW w:type="dxa" w:w="4138"/>
-            <w:tcBorders>
-              <w:top w:val="single" w:color="BFC5C9" w:sz="4"/>
-              <w:left w:val="single" w:color="BFC5C9" w:sz="4"/>
-              <w:bottom w:val="single" w:color="BFC5C9" w:sz="4"/>
-              <w:right w:val="single" w:color="BFC5C9" w:sz="4"/>
-            </w:tcBorders>
-            <w:tcMar>
-              <w:top w:type="dxa" w:w="80"/>
-              <w:left w:type="dxa" w:w="120"/>
-              <w:bottom w:type="dxa" w:w="80"/>
-              <w:right w:type="dxa" w:w="120"/>
-            </w:tcMar>
-          </w:tcPr>
-          <w:p>
-            <w:r>
-              <w:rPr>
-                <w:rFonts w:ascii="Calibri" w:cs="Calibri" w:eastAsia="Calibri" w:hAnsi="Calibri"/>
-                <w:b w:val="false"/>
-                <w:bCs w:val="false"/>
-                <w:sz w:val="20"/>
-                <w:szCs w:val="20"/>
-              </w:rPr>
-              <w:t xml:space="preserve">Primero pensáis los vuestros; después, si queréis, pedís ideas a la IA. Se explica cómo se mide, no qué se conseguirá.</w:t>
-            </w:r>
-          </w:p>
-        </w:tc>
-      </w:tr>
-      <w:tr>
-        <w:trPr>
-          <w:trHeight w:val="500" w:hRule="atLeast"/>
-        </w:trPr>
-        <w:tc>
-          <w:tcPr>
-            <w:tcW w:type="dxa" w:w="2600"/>
-            <w:tcBorders>
-              <w:top w:val="single" w:color="BFC5C9" w:sz="4"/>
-              <w:left w:val="single" w:color="BFC5C9" w:sz="4"/>
-              <w:bottom w:val="single" w:color="BFC5C9" w:sz="4"/>
-              <w:right w:val="single" w:color="BFC5C9" w:sz="4"/>
-            </w:tcBorders>
-            <w:tcMar>
-              <w:top w:type="dxa" w:w="80"/>
-              <w:left w:type="dxa" w:w="120"/>
-              <w:bottom w:type="dxa" w:w="80"/>
-              <w:right w:type="dxa" w:w="120"/>
-            </w:tcMar>
-          </w:tcPr>
-          <w:p>
-            <w:r>
-              <w:rPr>
-                <w:rFonts w:ascii="Calibri" w:cs="Calibri" w:eastAsia="Calibri" w:hAnsi="Calibri"/>
-                <w:b/>
-                <w:bCs/>
-                <w:sz w:val="20"/>
-                <w:szCs w:val="20"/>
-              </w:rPr>
-              <w:t xml:space="preserve">Presentación</w:t>
-            </w:r>
-          </w:p>
-        </w:tc>
-        <w:tc>
-          <w:tcPr>
-            <w:tcW w:type="dxa" w:w="2900"/>
-            <w:tcBorders>
-              <w:top w:val="single" w:color="BFC5C9" w:sz="4"/>
-              <w:left w:val="single" w:color="BFC5C9" w:sz="4"/>
-              <w:bottom w:val="single" w:color="BFC5C9" w:sz="4"/>
-              <w:right w:val="single" w:color="BFC5C9" w:sz="4"/>
-            </w:tcBorders>
-            <w:tcMar>
-              <w:top w:type="dxa" w:w="80"/>
-              <w:left w:type="dxa" w:w="120"/>
-              <w:bottom w:type="dxa" w:w="80"/>
-              <w:right w:type="dxa" w:w="120"/>
-            </w:tcMar>
-          </w:tcPr>
-          <w:p>
-            <w:r>
-              <w:rPr>
-                <w:rFonts w:ascii="Calibri" w:cs="Calibri" w:eastAsia="Calibri" w:hAnsi="Calibri"/>
-                <w:b w:val="false"/>
-                <w:bCs w:val="false"/>
-                <w:sz w:val="20"/>
-                <w:szCs w:val="20"/>
-              </w:rPr>
-              <w:t xml:space="preserve">presentacion_proyecto.pptx</w:t>
-            </w:r>
-          </w:p>
-        </w:tc>
-        <w:tc>
-          <w:tcPr>
-            <w:tcW w:type="dxa" w:w="4138"/>
-            <w:tcBorders>
-              <w:top w:val="single" w:color="BFC5C9" w:sz="4"/>
-              <w:left w:val="single" w:color="BFC5C9" w:sz="4"/>
-              <w:bottom w:val="single" w:color="BFC5C9" w:sz="4"/>
-              <w:right w:val="single" w:color="BFC5C9" w:sz="4"/>
-            </w:tcBorders>
-            <w:tcMar>
-              <w:top w:type="dxa" w:w="80"/>
-              <w:left w:type="dxa" w:w="120"/>
-              <w:bottom w:type="dxa" w:w="80"/>
-              <w:right w:type="dxa" w:w="120"/>
-            </w:tcMar>
-          </w:tcPr>
-          <w:p>
-            <w:r>
-              <w:rPr>
-                <w:rFonts w:ascii="Calibri" w:cs="Calibri" w:eastAsia="Calibri" w:hAnsi="Calibri"/>
-                <w:b w:val="false"/>
-                <w:bCs w:val="false"/>
-                <w:sz w:val="20"/>
-                <w:szCs w:val="20"/>
-              </w:rPr>
-              <w:t xml:space="preserve">Tres diapositivas: problema, solución y beneficios. Una idea por diapositiva y poco texto.</w:t>
-            </w:r>
-          </w:p>
-        </w:tc>
-      </w:tr>
-    </w:tbl>
-    <w:p>
-      <w:pPr>
-        <w:keepNext/>
-        <w:spacing w:after="80" w:before="200"/>
-      </w:pPr>
-      <w:r>
-        <w:rPr>
-          <w:rFonts w:ascii="Arial" w:cs="Arial" w:eastAsia="Arial" w:hAnsi="Arial"/>
-          <w:b/>
-          <w:bCs/>
-          <w:color w:val="1F2A30"/>
-          <w:sz w:val="24"/>
-          <w:szCs w:val="24"/>
-        </w:rPr>
-        <w:t xml:space="preserve">Revisión cruzada</w:t>
-      </w:r>
-    </w:p>
-    <w:p>
-      <w:pPr>
-        <w:spacing w:after="100"/>
-      </w:pPr>
-      <w:r>
-        <w:rPr>
-          <w:rFonts w:ascii="Calibri" w:cs="Calibri" w:eastAsia="Calibri" w:hAnsi="Calibri"/>
-          <w:sz w:val="22"/>
-          <w:szCs w:val="22"/>
-        </w:rPr>
-        <w:t xml:space="preserve">Os intercambiáis la presentación con la pareja de las preguntas difíciles y comprobáis: ¿una idea por diapositiva?, ¿poco texto?, ¿alguna cifra sin justificar?</w:t>
-      </w:r>
-    </w:p>
-    <w:tbl>
-      <w:tblPr>
-        <w:tblW w:type="dxa" w:w="9638"/>
-        <w:tblBorders>
-          <w:top w:val="single" w:color="auto" w:sz="4"/>
-          <w:left w:val="single" w:color="auto" w:sz="4"/>
-          <w:bottom w:val="single" w:color="auto" w:sz="4"/>
-          <w:right w:val="single" w:color="auto" w:sz="4"/>
-          <w:insideH w:val="single" w:color="auto" w:sz="4"/>
-          <w:insideV w:val="single" w:color="auto" w:sz="4"/>
-        </w:tblBorders>
-      </w:tblPr>
-      <w:tblGrid>
-        <w:gridCol w:w="4819"/>
-        <w:gridCol w:w="4819"/>
-      </w:tblGrid>
-      <w:tr>
-        <w:trPr>
-          <w:tblHeader/>
-        </w:trPr>
-        <w:tc>
-          <w:tcPr>
-            <w:tcW w:type="dxa" w:w="4819"/>
-            <w:tcBorders>
-              <w:top w:val="single" w:color="BFC5C9" w:sz="4"/>
-              <w:left w:val="single" w:color="BFC5C9" w:sz="4"/>
-              <w:bottom w:val="single" w:color="BFC5C9" w:sz="4"/>
-              <w:right w:val="single" w:color="BFC5C9" w:sz="4"/>
-            </w:tcBorders>
-            <w:shd w:fill="1F2A30" w:color="auto" w:val="clear"/>
-            <w:tcMar>
-              <w:top w:type="dxa" w:w="80"/>
-              <w:left w:type="dxa" w:w="120"/>
-              <w:bottom w:type="dxa" w:w="80"/>
-              <w:right w:type="dxa" w:w="120"/>
-            </w:tcMar>
-            <w:vAlign w:val="center"/>
-          </w:tcPr>
-          <w:p>
-            <w:r>
-              <w:rPr>
-                <w:rFonts w:ascii="Calibri" w:cs="Calibri" w:eastAsia="Calibri" w:hAnsi="Calibri"/>
-                <w:b/>
-                <w:bCs/>
-                <w:color w:val="FFFFFF"/>
-                <w:sz w:val="20"/>
-                <w:szCs w:val="20"/>
-              </w:rPr>
-              <w:t xml:space="preserve">Mejora que nos propone la otra pareja</w:t>
-            </w:r>
-          </w:p>
-        </w:tc>
-        <w:tc>
-          <w:tcPr>
-            <w:tcW w:type="dxa" w:w="4819"/>
-            <w:tcBorders>
-              <w:top w:val="single" w:color="BFC5C9" w:sz="4"/>
-              <w:left w:val="single" w:color="BFC5C9" w:sz="4"/>
-              <w:bottom w:val="single" w:color="BFC5C9" w:sz="4"/>
-              <w:right w:val="single" w:color="BFC5C9" w:sz="4"/>
-            </w:tcBorders>
-            <w:shd w:fill="1F2A30" w:color="auto" w:val="clear"/>
-            <w:tcMar>
-              <w:top w:type="dxa" w:w="80"/>
-              <w:left w:type="dxa" w:w="120"/>
-              <w:bottom w:type="dxa" w:w="80"/>
-              <w:right w:type="dxa" w:w="120"/>
-            </w:tcMar>
-            <w:vAlign w:val="center"/>
-          </w:tcPr>
-          <w:p>
-            <w:r>
-              <w:rPr>
-                <w:rFonts w:ascii="Calibri" w:cs="Calibri" w:eastAsia="Calibri" w:hAnsi="Calibri"/>
-                <w:b/>
-                <w:bCs/>
-                <w:color w:val="FFFFFF"/>
-                <w:sz w:val="20"/>
-                <w:szCs w:val="20"/>
-              </w:rPr>
-              <w:t xml:space="preserve">Mejora que les proponemos</w:t>
-            </w:r>
-          </w:p>
-        </w:tc>
-      </w:tr>
-      <w:tr>
-        <w:trPr>
-          <w:trHeight w:val="1200" w:hRule="atLeast"/>
-        </w:trPr>
-        <w:tc>
-          <w:tcPr>
-            <w:tcW w:type="dxa" w:w="4819"/>
-            <w:tcBorders>
-              <w:top w:val="single" w:color="BFC5C9" w:sz="4"/>
-              <w:left w:val="single" w:color="BFC5C9" w:sz="4"/>
-              <w:bottom w:val="single" w:color="BFC5C9" w:sz="4"/>
-              <w:right w:val="single" w:color="BFC5C9" w:sz="4"/>
-            </w:tcBorders>
-            <w:shd w:fill="FDEFCC" w:color="auto" w:val="clear"/>
-            <w:tcMar>
-              <w:top w:type="dxa" w:w="80"/>
-              <w:left w:type="dxa" w:w="120"/>
-              <w:bottom w:type="dxa" w:w="80"/>
-              <w:right w:type="dxa" w:w="120"/>
-            </w:tcMar>
-          </w:tcPr>
-          <w:p>
-            <w:r>
-              <w:rPr>
-                <w:rFonts w:ascii="Calibri" w:cs="Calibri" w:eastAsia="Calibri" w:hAnsi="Calibri"/>
-                <w:i/>
-                <w:iCs/>
-                <w:color w:val="6B7780"/>
-                <w:sz w:val="20"/>
-                <w:szCs w:val="20"/>
-              </w:rPr>
-              <w:t xml:space="preserve"/>
-            </w:r>
-          </w:p>
-        </w:tc>
-        <w:tc>
-          <w:tcPr>
-            <w:tcW w:type="dxa" w:w="4819"/>
-            <w:tcBorders>
-              <w:top w:val="single" w:color="BFC5C9" w:sz="4"/>
-              <w:left w:val="single" w:color="BFC5C9" w:sz="4"/>
-              <w:bottom w:val="single" w:color="BFC5C9" w:sz="4"/>
-              <w:right w:val="single" w:color="BFC5C9" w:sz="4"/>
-            </w:tcBorders>
-            <w:shd w:fill="FDEFCC" w:color="auto" w:val="clear"/>
-            <w:tcMar>
-              <w:top w:type="dxa" w:w="80"/>
-              <w:left w:type="dxa" w:w="120"/>
-              <w:bottom w:type="dxa" w:w="80"/>
-              <w:right w:type="dxa" w:w="120"/>
-            </w:tcMar>
-          </w:tcPr>
-          <w:p>
-            <w:r>
-              <w:rPr>
-                <w:rFonts w:ascii="Calibri" w:cs="Calibri" w:eastAsia="Calibri" w:hAnsi="Calibri"/>
-                <w:i/>
-                <w:iCs/>
-                <w:color w:val="6B7780"/>
-                <w:sz w:val="20"/>
-                <w:szCs w:val="20"/>
-              </w:rPr>
-              <w:t xml:space="preserve"/>
             </w:r>
           </w:p>
         </w:tc>

</xml_diff>